<commit_message>
Stage 2 (v1.2.0): Execute all 5 production upgrades and update docs (.md, .json, .docx, .pdf)
</commit_message>
<xml_diff>
--- a/docs/NAS_Microfinance_Blueprint.docx
+++ b/docs/NAS_Microfinance_Blueprint.docx
@@ -2339,6 +2339,54 @@
     </w:p>
     <w:p>
       <w:pPr>
+        <w:pStyle w:val="Heading2"/>
+      </w:pPr>
+      <w:r>
+        <w:t>Phase 6: Stage 2 Production Hardening &amp; Live Operations (v1.2.0)</w:t>
+      </w:r>
+    </w:p>
+    <w:p>
+      <w:pPr>
+        <w:pStyle w:val="ListBullet"/>
+      </w:pPr>
+      <w:r>
+        <w:t>Upgrade 1: Front-door authentication lock + in-app Admin/Lender Email, Phone &amp; Password changer</w:t>
+      </w:r>
+    </w:p>
+    <w:p>
+      <w:pPr>
+        <w:pStyle w:val="ListBullet"/>
+      </w:pPr>
+      <w:r>
+        <w:t>Upgrade 2: One-click 'Clear Sample Data (Start Fresh at TZS 0)' portfolio reset</w:t>
+      </w:r>
+    </w:p>
+    <w:p>
+      <w:pPr>
+        <w:pStyle w:val="ListBullet"/>
+      </w:pPr>
+      <w:r>
+        <w:t>Upgrade 3: Full Edit &amp; Delete controls for Clients, Mandatory Referrals, and TZS Loans</w:t>
+      </w:r>
+    </w:p>
+    <w:p>
+      <w:pPr>
+        <w:pStyle w:val="ListBullet"/>
+      </w:pPr>
+      <w:r>
+        <w:t>Upgrade 4: Branded 192x192 &amp; 512x512 PWA Icons, Service Worker, and in-app 'Install App' button</w:t>
+      </w:r>
+    </w:p>
+    <w:p>
+      <w:pPr>
+        <w:pStyle w:val="ListBullet"/>
+      </w:pPr>
+      <w:r>
+        <w:t>Upgrade 5: One-click 'Export TZS Portfolio to Excel (CSV)' backup generator</w:t>
+      </w:r>
+    </w:p>
+    <w:p>
+      <w:pPr>
         <w:pStyle w:val="Heading1"/>
       </w:pPr>
       <w:r>
@@ -2352,10 +2400,12 @@
         <w:t>## Complete Product Specification, UI/UX Appearance Mockups, Interaction Matrix &amp; Step-by-Step Implementation Blueprint</w:t>
         <w:br/>
         <w:br/>
-        <w:t>- **Document Version:** 1.1.0 (Updated with **TZS Currency** &amp; **Mandatory Client Referral / Guarantor Tracking**)</w:t>
+        <w:t>- **Document Version:** 1.2.0 (Updated with **TZS Currency**, **Mandatory Client Referral Tracking** &amp; **Stage 2 Production Hardening Plan**)</w:t>
         <w:br/>
         <w:t>- **Date:** October 20, 2026</w:t>
         <w:br/>
+        <w:t>- **Live Production URL:** https://na-smicrofinance-management.vercel.app/</w:t>
+        <w:br/>
         <w:t>- **Primary Currency:** Tanzanian Shilling (**TZS**)</w:t>
         <w:br/>
         <w:t>- **Platform Architecture:** Cross-Platform Installable Progressive Web App (PWA) — Windows/Mac Desktop &amp; iOS/Android Mobile</w:t>
@@ -3360,6 +3410,47 @@
         <w:t>4. **Phase 4 — Executive TZS Dashboard, Loan + Referral Modal &amp; Repayment Drawer:** Implement all 6 screens with mandatory Referral fields, Tanzanian Mobile Money methods (`M-Pesa`, `Tigo Pesa`, `Airtel Money`, `HaloPesa`, `Cash`), and 1-tap Client/Referral WhatsApp reminders (English &amp; Swahili templates).</w:t>
         <w:br/>
         <w:t>5. **Phase 5 — Cloud Sync, Global Keyboard Shortcuts &amp; Verification:** Wire up real-time cross-network cloud synchronization, global desktop shortcuts (`N`, `P`, `R`, `W`, `O`, `Ctrl+K`, etc.), and end-to-end verification.</w:t>
+        <w:br/>
+        <w:br/>
+        <w:t>---</w:t>
+        <w:br/>
+        <w:br/>
+        <w:t>## 10. Stage 2: Production Hardening &amp; Live Operations Blueprint (v1.2.0)</w:t>
+        <w:br/>
+        <w:br/>
+        <w:t>Following live verification on **https://na-smicrofinance-management.vercel.app/** and **Supabase Cloud (`bmvltojicwzqzysdpbwn.supabase.co`)**, Stage 2 locks in 5 production-grade upgrades for live lending operations:</w:t>
+        <w:br/>
+        <w:br/>
+        <w:t>### Upgrade 1: Front-Door Authentication Lock &amp; Admin Credential Manager</w:t>
+        <w:br/>
+        <w:t>- **Behavior:** Unauthenticated visitors arriving at `https://na-smicrofinance-management.vercel.app/` land strictly on **Screen 1 (Sign In / Activate New Account)** rather than auto-entering the Super Admin demo session.</w:t>
+        <w:br/>
+        <w:t>- **Security Controls:** Inside the workspace (**Account &amp; Security Settings**), the Super Admin and any licensed lender can update their **Business Name**, **Login Email/Phone**, and **Password** at any time, immediately syncing to Supabase Cloud.</w:t>
+        <w:br/>
+        <w:br/>
+        <w:t>### Upgrade 2: One-Click "Clear Sample Data (Start Fresh at TZS 0)"</w:t>
+        <w:br/>
+        <w:t>- **Behavior:** Provides a protected action in the **Cloud Sync &amp; Portfolio Reset Modal** allowing the Super Admin to wipe the 4 pre-loaded demo clients/loans and start their real portfolio at **TZS 0**, while preserving all user accounts and activation keys.</w:t>
+        <w:br/>
+        <w:br/>
+        <w:t>### Upgrade 3: Full CRUD (Edit &amp; Delete) for Clients, Referrals &amp; Loans</w:t>
+        <w:br/>
+        <w:t>- **Edit Client &amp; Referral Details:** Edit a client's Full Name, Phone (`+255...`), NIDA/ID, Collateral Notes, and their **Mandatory Referral / Guarantor** (Referral Name, Phone, Relationship, Location, Trust Score) from either the Clients Directory or the Loan Drawer.</w:t>
+        <w:br/>
+        <w:t>- **Edit &amp; Delete Loan Records:** Modify Principal Offered (`TZS`), Interest `%`, Duration (`Days`), Issue/Due Date, Overdue `"Or Else"` Rule, or delete an erroneous loan entry with full audit logging.</w:t>
+        <w:br/>
+        <w:br/>
+        <w:t>### Upgrade 4: Installable PWA App Icons (`192x192` &amp; `512x512`), Service Worker &amp; In-App Install Button</w:t>
+        <w:br/>
+        <w:t>- **Assets:** High-contrast emerald-and-navy `icon-192.png` and `icon-512.png` icons linked in `public/manifest.json` alongside `public/sw.js`.</w:t>
+        <w:br/>
+        <w:t>- **In-App Install Trigger:** Captures `beforeinstallprompt` on Android/Windows Chrome/Edge and provides guided 1-tap install instructions for iOS Safari so users can click **📲 Install App** directly inside the header/sidebar.</w:t>
+        <w:br/>
+        <w:br/>
+        <w:t>### Upgrade 5: One-Click Excel / CSV Portfolio &amp; Referral Backup (`📥 Export CSV`)</w:t>
+        <w:br/>
+        <w:t>- **Behavior:** Exports the entire TZS portfolio (Loan #, Client Name &amp; Phone, NIDA, Mandatory Referral Name, Referral Phone, Relationship, Location, Principal TZS, Interest %, Base Profit, Overdue Rollover, Total Expected, Amount Paid, Remaining Balance, Realized Profit, Issue/Due Dates, and Status) as a UTF-8 Excel-ready `.csv` file.</w:t>
+        <w:br/>
         <w:br/>
       </w:r>
     </w:p>

</xml_diff>